<commit_message>
test(security): consolidate Gemini regression gate
</commit_message>
<xml_diff>
--- a/Security/IA_RealTime_CenterCall_Guia_Viva_Seguridad.docx
+++ b/Security/IA_RealTime_CenterCall_Guia_Viva_Seguridad.docx
@@ -126,14 +126,9 @@
             <w:vAlign w:val="center"/>
           </w:tcPr>
           <w:p>
-            <w:pPr>
-              <w:spacing w:after="0"/>
-            </w:pPr>
-            <w:r/>
             <w:r>
               <w:rPr>
                 <w:rFonts w:ascii="Aptos" w:hAnsi="Aptos"/>
-                <w:b w:val="0"/>
                 <w:sz w:val="18"/>
               </w:rPr>
               <w:t>Vigente</w:t>
@@ -147,7 +142,13 @@
           </w:tcPr>
           <w:p>
             <w:r>
-              <w:t>31 agosto 2026</w:t>
+              <w:rPr>
+                <w:rFonts w:ascii="Aptos" w:hAnsi="Aptos"/>
+                <w:sz w:val="18"/>
+              </w:rPr>
+              <w:t>12 septiembre 2026</w:t>
+              <w:br/>
+              <w:t>Stable 6b7d7a43e95a</w:t>
             </w:r>
           </w:p>
         </w:tc>
@@ -1328,7 +1329,11 @@
           </w:tcPr>
           <w:p>
             <w:r>
-              <w:t>3 observaciones autorizadas y distintas, despedida segura y hangup Worker/Telnyx</w:t>
+              <w:rPr>
+                <w:rFonts w:ascii="Aptos" w:hAnsi="Aptos"/>
+                <w:sz w:val="18"/>
+              </w:rPr>
+              <w:t>3 observaciones autorizadas y distintas; despedida, marca Telnyx exacta y hangup exclusivo Worker/Telnyx</w:t>
             </w:r>
           </w:p>
         </w:tc>
@@ -1338,7 +1343,55 @@
           </w:tcPr>
           <w:p>
             <w:r>
-              <w:t>Desplegado; CI y canary PASS; E2E real pendiente</w:t>
+              <w:rPr>
+                <w:rFonts w:ascii="Aptos" w:hAnsi="Aptos"/>
+                <w:sz w:val="18"/>
+              </w:rPr>
+              <w:t>Desplegado; 110/110 tests, canary y Docker PASS; E2E real pendiente</w:t>
+            </w:r>
+          </w:p>
+        </w:tc>
+      </w:tr>
+      <w:tr>
+        <w:tc>
+          <w:tcPr>
+            <w:tcW w:type="dxa" w:w="3312"/>
+          </w:tcPr>
+          <w:p>
+            <w:r>
+              <w:rPr>
+                <w:rFonts w:ascii="Aptos" w:hAnsi="Aptos"/>
+                <w:sz w:val="18"/>
+              </w:rPr>
+              <w:t>Regresión consolidada de seguridad</w:t>
+            </w:r>
+          </w:p>
+        </w:tc>
+        <w:tc>
+          <w:tcPr>
+            <w:tcW w:type="dxa" w:w="3312"/>
+          </w:tcPr>
+          <w:p>
+            <w:r>
+              <w:rPr>
+                <w:rFonts w:ascii="Aptos" w:hAnsi="Aptos"/>
+                <w:sz w:val="18"/>
+              </w:rPr>
+              <w:t>Runner común, suites Media Edge y Control Plane, y gate CI final</w:t>
+            </w:r>
+          </w:p>
+        </w:tc>
+        <w:tc>
+          <w:tcPr>
+            <w:tcW w:type="dxa" w:w="3312"/>
+          </w:tcPr>
+          <w:p>
+            <w:r>
+              <w:rPr>
+                <w:rFonts w:ascii="Aptos" w:hAnsi="Aptos"/>
+                <w:sz w:val="18"/>
+              </w:rPr>
+              <w:t>Batería local PASS; CI pendiente</w:t>
             </w:r>
           </w:p>
         </w:tc>
@@ -2891,17 +2944,12 @@
             <w:shd w:fill="EEF1F4"/>
           </w:tcPr>
           <w:p>
-            <w:pPr>
-              <w:spacing w:after="0"/>
-            </w:pPr>
-            <w:r/>
             <w:r>
               <w:rPr>
                 <w:rFonts w:ascii="Aptos" w:hAnsi="Aptos"/>
-                <w:b w:val="0"/>
                 <w:sz w:val="18"/>
               </w:rPr>
-              <w:t>Suite consolidada de regresión</w:t>
+              <w:t>Activar suite consolidada de regresión</w:t>
             </w:r>
           </w:p>
         </w:tc>
@@ -2912,17 +2960,12 @@
             <w:shd w:fill="EEF1F4"/>
           </w:tcPr>
           <w:p>
-            <w:pPr>
-              <w:spacing w:after="0"/>
-            </w:pPr>
-            <w:r/>
             <w:r>
               <w:rPr>
                 <w:rFonts w:ascii="Aptos" w:hAnsi="Aptos"/>
-                <w:b w:val="0"/>
                 <w:sz w:val="18"/>
               </w:rPr>
-              <w:t>Gate CI reproducible</w:t>
+              <w:t>PR y gate CI verde</w:t>
             </w:r>
           </w:p>
         </w:tc>
@@ -3669,7 +3712,85 @@
           </w:p>
         </w:tc>
       </w:tr>
+      <w:tr>
+        <w:tc>
+          <w:tcPr>
+            <w:tcW w:type="dxa" w:w="4968"/>
+          </w:tcPr>
+          <w:p>
+            <w:r>
+              <w:rPr>
+                <w:rFonts w:ascii="Aptos" w:hAnsi="Aptos"/>
+                <w:sz w:val="18"/>
+              </w:rPr>
+              <w:t>Gate único de regresión de seguridad</w:t>
+            </w:r>
+          </w:p>
+        </w:tc>
+        <w:tc>
+          <w:tcPr>
+            <w:tcW w:type="dxa" w:w="4968"/>
+          </w:tcPr>
+          <w:p>
+            <w:r>
+              <w:rPr>
+                <w:rFonts w:ascii="Aptos" w:hAnsi="Aptos"/>
+                <w:sz w:val="18"/>
+              </w:rPr>
+              <w:t>Implementado y validado localmente; CI pendiente</w:t>
+            </w:r>
+          </w:p>
+        </w:tc>
+      </w:tr>
     </w:tbl>
+    <w:p>
+      <w:pPr>
+        <w:pStyle w:val="Heading1"/>
+      </w:pPr>
+      <w:r>
+        <w:t>12. Estado de implementación actual</w:t>
+      </w:r>
+    </w:p>
+    <w:p>
+      <w:pPr>
+        <w:pStyle w:val="ListBullet"/>
+      </w:pPr>
+      <w:r>
+        <w:t>Base estable verificada: rebuild/v39-stable-baseline @ 6b7d7a43e95aaf1b3fd1d3ea2261ea6a0ea544b2.</w:t>
+      </w:r>
+    </w:p>
+    <w:p>
+      <w:pPr>
+        <w:pStyle w:val="ListBullet"/>
+      </w:pPr>
+      <w:r>
+        <w:t>Corrección de despedida: PR #100 desplegada en gemini-media-edge-00224-fim con 100 % del tráfico; el hangup espera evidencia exacta de reproducción Telnyx y conserva fallbacks explícitos.</w:t>
+      </w:r>
+    </w:p>
+    <w:p>
+      <w:pPr>
+        <w:pStyle w:val="ListBullet"/>
+      </w:pPr>
+      <w:r>
+        <w:t>Impacto hot path: ninguno. La corrección sólo actúa en la ruta terminal excepcional y el nuevo gate sólo ejecuta pruebas/CI.</w:t>
+      </w:r>
+    </w:p>
+    <w:p>
+      <w:pPr>
+        <w:pStyle w:val="ListBullet"/>
+      </w:pPr>
+      <w:r>
+        <w:t>SEC-P1-03: runner común y workflow Gemini Security Regression Gate implementados; batería local completa PASS y activación CI pendiente.</w:t>
+      </w:r>
+    </w:p>
+    <w:p>
+      <w:pPr>
+        <w:pStyle w:val="ListBullet"/>
+      </w:pPr>
+      <w:r>
+        <w:t>Orden acordado: desarrollar el gate, actualizar esta guía, ejecutar la batería técnica y dejar la llamada E2E SEC-P1-01 para el cierre.</w:t>
+      </w:r>
+    </w:p>
     <w:sectPr>
       <w:footerReference w:type="default" r:id="rId9"/>
       <w:pgSz w:w="12240" w:h="15840"/>

</xml_diff>

<commit_message>
feat(security): add bounded data retention
</commit_message>
<xml_diff>
--- a/Security/IA_RealTime_CenterCall_Guia_Viva_Seguridad.docx
+++ b/Security/IA_RealTime_CenterCall_Guia_Viva_Seguridad.docx
@@ -142,13 +142,9 @@
           </w:tcPr>
           <w:p>
             <w:r>
-              <w:rPr>
-                <w:rFonts w:ascii="Aptos" w:hAnsi="Aptos"/>
-                <w:sz w:val="18"/>
-              </w:rPr>
-              <w:t>12 septiembre 2026</w:t>
+              <w:t>13 septiembre 2026</w:t>
               <w:br/>
-              <w:t>Stable 6b7d7a43e95a</w:t>
+              <w:t>Stable d0e48b716d25</w:t>
             </w:r>
           </w:p>
         </w:tc>
@@ -1340,14 +1336,11 @@
         <w:tc>
           <w:tcPr>
             <w:tcW w:type="dxa" w:w="3312"/>
+            <w:vAlign w:val="center"/>
           </w:tcPr>
           <w:p>
             <w:r>
-              <w:rPr>
-                <w:rFonts w:ascii="Aptos" w:hAnsi="Aptos"/>
-                <w:sz w:val="18"/>
-              </w:rPr>
-              <w:t>Desplegado; 110/110 tests, canary y Docker PASS; E2E real pendiente</w:t>
+              <w:t>Desplegado y E2E real verificado</w:t>
             </w:r>
           </w:p>
         </w:tc>
@@ -1384,14 +1377,46 @@
         <w:tc>
           <w:tcPr>
             <w:tcW w:type="dxa" w:w="3312"/>
+            <w:vAlign w:val="center"/>
           </w:tcPr>
           <w:p>
             <w:r>
-              <w:rPr>
-                <w:rFonts w:ascii="Aptos" w:hAnsi="Aptos"/>
-                <w:sz w:val="18"/>
-              </w:rPr>
-              <w:t>Batería local PASS; CI pendiente</w:t>
+              <w:t>PR #101 fusionada; gate CI verde</w:t>
+            </w:r>
+          </w:p>
+        </w:tc>
+      </w:tr>
+      <w:tr>
+        <w:tc>
+          <w:tcPr>
+            <w:tcW w:type="dxa" w:w="3312"/>
+            <w:vAlign w:val="center"/>
+          </w:tcPr>
+          <w:p>
+            <w:r>
+              <w:t>Retención y borrado</w:t>
+            </w:r>
+          </w:p>
+        </w:tc>
+        <w:tc>
+          <w:tcPr>
+            <w:tcW w:type="dxa" w:w="3312"/>
+            <w:vAlign w:val="center"/>
+          </w:tcPr>
+          <w:p>
+            <w:r>
+              <w:t>Purga privada por lotes, cron diario y auditoría agregada</w:t>
+            </w:r>
+          </w:p>
+        </w:tc>
+        <w:tc>
+          <w:tcPr>
+            <w:tcW w:type="dxa" w:w="3312"/>
+            <w:vAlign w:val="center"/>
+          </w:tcPr>
+          <w:p>
+            <w:r>
+              <w:t>Implementado localmente; migración pendiente</w:t>
             </w:r>
           </w:p>
         </w:tc>
@@ -2844,152 +2869,6 @@
                 <w:b w:val="0"/>
                 <w:sz w:val="18"/>
               </w:rPr>
-              <w:t>SEC-P1-01</w:t>
-            </w:r>
-          </w:p>
-        </w:tc>
-        <w:tc>
-          <w:tcPr>
-            <w:tcW w:type="dxa" w:w="1512"/>
-            <w:vAlign w:val="center"/>
-          </w:tcPr>
-          <w:p>
-            <w:pPr>
-              <w:spacing w:after="0"/>
-            </w:pPr>
-            <w:r/>
-            <w:r>
-              <w:rPr>
-                <w:rFonts w:ascii="Aptos" w:hAnsi="Aptos"/>
-                <w:b w:val="0"/>
-                <w:sz w:val="18"/>
-              </w:rPr>
-              <w:t>P1</w:t>
-            </w:r>
-          </w:p>
-        </w:tc>
-        <w:tc>
-          <w:tcPr>
-            <w:tcW w:type="dxa" w:w="3240"/>
-            <w:vAlign w:val="center"/>
-          </w:tcPr>
-          <w:p>
-            <w:r>
-              <w:t>Validar E2E cierre semántico high-confidence</w:t>
-            </w:r>
-          </w:p>
-        </w:tc>
-        <w:tc>
-          <w:tcPr>
-            <w:tcW w:type="dxa" w:w="4104"/>
-            <w:vAlign w:val="center"/>
-          </w:tcPr>
-          <w:p>
-            <w:r>
-              <w:t>Llamada real: 3 observaciones, despedida, hangup y señal HIGH</w:t>
-            </w:r>
-          </w:p>
-        </w:tc>
-      </w:tr>
-      <w:tr>
-        <w:trPr>
-          <w:cantSplit/>
-        </w:trPr>
-        <w:tc>
-          <w:tcPr>
-            <w:tcW w:type="dxa" w:w="1224"/>
-            <w:vAlign w:val="center"/>
-            <w:shd w:fill="EEF1F4"/>
-          </w:tcPr>
-          <w:p>
-            <w:pPr>
-              <w:spacing w:after="0"/>
-            </w:pPr>
-            <w:r/>
-            <w:r>
-              <w:rPr>
-                <w:rFonts w:ascii="Aptos" w:hAnsi="Aptos"/>
-                <w:b w:val="0"/>
-                <w:sz w:val="18"/>
-              </w:rPr>
-              <w:t>SEC-P1-03</w:t>
-            </w:r>
-          </w:p>
-        </w:tc>
-        <w:tc>
-          <w:tcPr>
-            <w:tcW w:type="dxa" w:w="1512"/>
-            <w:vAlign w:val="center"/>
-            <w:shd w:fill="EEF1F4"/>
-          </w:tcPr>
-          <w:p>
-            <w:pPr>
-              <w:spacing w:after="0"/>
-            </w:pPr>
-            <w:r/>
-            <w:r>
-              <w:rPr>
-                <w:rFonts w:ascii="Aptos" w:hAnsi="Aptos"/>
-                <w:b w:val="0"/>
-                <w:sz w:val="18"/>
-              </w:rPr>
-              <w:t>P1</w:t>
-            </w:r>
-          </w:p>
-        </w:tc>
-        <w:tc>
-          <w:tcPr>
-            <w:tcW w:type="dxa" w:w="3240"/>
-            <w:vAlign w:val="center"/>
-            <w:shd w:fill="EEF1F4"/>
-          </w:tcPr>
-          <w:p>
-            <w:r>
-              <w:rPr>
-                <w:rFonts w:ascii="Aptos" w:hAnsi="Aptos"/>
-                <w:sz w:val="18"/>
-              </w:rPr>
-              <w:t>Activar suite consolidada de regresión</w:t>
-            </w:r>
-          </w:p>
-        </w:tc>
-        <w:tc>
-          <w:tcPr>
-            <w:tcW w:type="dxa" w:w="4104"/>
-            <w:vAlign w:val="center"/>
-            <w:shd w:fill="EEF1F4"/>
-          </w:tcPr>
-          <w:p>
-            <w:r>
-              <w:rPr>
-                <w:rFonts w:ascii="Aptos" w:hAnsi="Aptos"/>
-                <w:sz w:val="18"/>
-              </w:rPr>
-              <w:t>PR y gate CI verde</w:t>
-            </w:r>
-          </w:p>
-        </w:tc>
-      </w:tr>
-      <w:tr>
-        <w:trPr>
-          <w:cantSplit/>
-        </w:trPr>
-        <w:tc>
-          <w:tcPr>
-            <w:tcW w:type="dxa" w:w="1224"/>
-            <w:vAlign w:val="center"/>
-          </w:tcPr>
-          <w:p>
-            <w:pPr>
-              <w:spacing w:after="0"/>
-            </w:pPr>
-            <w:r/>
-            <w:r>
-              <w:rPr>
-                <w:rFonts w:ascii="Aptos" w:hAnsi="Aptos"/>
-                <w:b w:val="0"/>
-                <w:sz w:val="18"/>
-              </w:rPr>
               <w:t>SEC-P1-04</w:t>
             </w:r>
           </w:p>
@@ -3023,14 +2902,8 @@
             <w:pPr>
               <w:spacing w:after="0"/>
             </w:pPr>
-            <w:r/>
             <w:r>
-              <w:rPr>
-                <w:rFonts w:ascii="Aptos" w:hAnsi="Aptos"/>
-                <w:b w:val="0"/>
-                <w:sz w:val="18"/>
-              </w:rPr>
-              <w:t>Retención y borrado</w:t>
+              <w:t>Publicar, aplicar y verificar retención y borrado</w:t>
             </w:r>
           </w:p>
         </w:tc>
@@ -3043,14 +2916,8 @@
             <w:pPr>
               <w:spacing w:after="0"/>
             </w:pPr>
-            <w:r/>
             <w:r>
-              <w:rPr>
-                <w:rFonts w:ascii="Aptos" w:hAnsi="Aptos"/>
-                <w:b w:val="0"/>
-                <w:sz w:val="18"/>
-              </w:rPr>
-              <w:t>Política y configuración verificadas</w:t>
+              <w:t>PR y CI verdes; migración, cron, primera ejecución y advisors verificados</w:t>
             </w:r>
           </w:p>
         </w:tc>
@@ -3704,10 +3571,11 @@
         <w:tc>
           <w:tcPr>
             <w:tcW w:type="dxa" w:w="4968"/>
+            <w:vAlign w:val="center"/>
           </w:tcPr>
           <w:p>
             <w:r>
-              <w:t>Desplegado; E2E real pendiente</w:t>
+              <w:t>Desplegado y E2E real verificado</w:t>
             </w:r>
           </w:p>
         </w:tc>
@@ -3730,14 +3598,35 @@
         <w:tc>
           <w:tcPr>
             <w:tcW w:type="dxa" w:w="4968"/>
+            <w:vAlign w:val="center"/>
           </w:tcPr>
           <w:p>
             <w:r>
-              <w:rPr>
-                <w:rFonts w:ascii="Aptos" w:hAnsi="Aptos"/>
-                <w:sz w:val="18"/>
-              </w:rPr>
-              <w:t>Implementado y validado localmente; CI pendiente</w:t>
+              <w:t>PR #101 fusionada; CI verde</w:t>
+            </w:r>
+          </w:p>
+        </w:tc>
+      </w:tr>
+      <w:tr>
+        <w:tc>
+          <w:tcPr>
+            <w:tcW w:type="dxa" w:w="4968"/>
+            <w:vAlign w:val="center"/>
+          </w:tcPr>
+          <w:p>
+            <w:r>
+              <w:t>Retención acotada fuera del hot path</w:t>
+            </w:r>
+          </w:p>
+        </w:tc>
+        <w:tc>
+          <w:tcPr>
+            <w:tcW w:type="dxa" w:w="4968"/>
+            <w:vAlign w:val="center"/>
+          </w:tcPr>
+          <w:p>
+            <w:r>
+              <w:t>Implementada localmente; migración productiva pendiente</w:t>
             </w:r>
           </w:p>
         </w:tc>
@@ -3756,7 +3645,7 @@
         <w:pStyle w:val="ListBullet"/>
       </w:pPr>
       <w:r>
-        <w:t>Base estable verificada: rebuild/v39-stable-baseline @ 6b7d7a43e95aaf1b3fd1d3ea2261ea6a0ea544b2.</w:t>
+        <w:t>Base estable verificada: rebuild/v39-stable-baseline @ d0e48b716d250c666e4873633809fe4699f98a28.</w:t>
       </w:r>
     </w:p>
     <w:p>
@@ -3764,7 +3653,7 @@
         <w:pStyle w:val="ListBullet"/>
       </w:pPr>
       <w:r>
-        <w:t>Corrección de despedida: PR #100 desplegada en gemini-media-edge-00224-fim con 100 % del tráfico; el hangup espera evidencia exacta de reproducción Telnyx y conserva fallbacks explícitos.</w:t>
+        <w:t>Corrección de despedida: PR #100 desplegada; la revisión gemini-media-edge-00227-qub recibe el 100 % del tráfico y el hangup espera la marca Telnyx exacta antes del cierre.</w:t>
       </w:r>
     </w:p>
     <w:p>
@@ -3772,7 +3661,7 @@
         <w:pStyle w:val="ListBullet"/>
       </w:pPr>
       <w:r>
-        <w:t>Impacto hot path: ninguno. La corrección sólo actúa en la ruta terminal excepcional y el nuevo gate sólo ejecuta pruebas/CI.</w:t>
+        <w:t>Impacto hot path: ninguno en SEC-P1-03 o SEC-P1-04. El gate sólo ejecuta pruebas y la retención se ejecuta por cron dentro de Supabase.</w:t>
       </w:r>
     </w:p>
     <w:p>
@@ -3780,7 +3669,7 @@
         <w:pStyle w:val="ListBullet"/>
       </w:pPr>
       <w:r>
-        <w:t>SEC-P1-03: runner común y workflow Gemini Security Regression Gate implementados; batería local completa PASS y activación CI pendiente.</w:t>
+        <w:t>SEC-P1-03: runner común y workflow Gemini Security Regression Gate publicados mediante PR #101; gate ampliado a 157/157 pruebas específicas PASS.</w:t>
       </w:r>
     </w:p>
     <w:p>
@@ -3788,7 +3677,289 @@
         <w:pStyle w:val="ListBullet"/>
       </w:pPr>
       <w:r>
-        <w:t>Orden acordado: desarrollar el gate, actualizar esta guía, ejecutar la batería técnica y dejar la llamada E2E SEC-P1-01 para el cierre.</w:t>
+        <w:t>SEC-P1-04: migración privada implementada y validada en PostgreSQL 17; contrato 5/5 y baterías completas 184/184 PASS. Commit, PR, CI y aplicación remota pendientes.</w:t>
+      </w:r>
+    </w:p>
+    <w:p>
+      <w:pPr>
+        <w:pStyle w:val="Heading1"/>
+        <w:pageBreakBefore/>
+      </w:pPr>
+      <w:r>
+        <w:t>13 Retención y borrado de datos de seguridad</w:t>
+      </w:r>
+    </w:p>
+    <w:p>
+      <w:r>
+        <w:t>SEC-P1-04 limita la evidencia durable sin debilitar decisiones activas. La autoridad de mantenimiento vive en PostgreSQL y no participa en admission, tools, turnos ni audio.</w:t>
+      </w:r>
+    </w:p>
+    <w:tbl>
+      <w:tblPr>
+        <w:tblStyle w:val="TableGrid"/>
+        <w:tblW w:type="auto" w:w="0"/>
+        <w:tblLayout w:type="fixed"/>
+        <w:tblLook w:firstColumn="1" w:firstRow="1" w:lastColumn="0" w:lastRow="0" w:noHBand="0" w:noVBand="1" w:val="04A0"/>
+      </w:tblPr>
+      <w:tblGrid>
+        <w:gridCol w:w="4968"/>
+        <w:gridCol w:w="4968"/>
+      </w:tblGrid>
+      <w:tr>
+        <w:trPr>
+          <w:tblHeader w:val="true"/>
+        </w:trPr>
+        <w:tc>
+          <w:tcPr>
+            <w:tcW w:type="dxa" w:w="3240"/>
+            <w:vAlign w:val="center"/>
+          </w:tcPr>
+          <w:p>
+            <w:r>
+              <w:t>Datos</w:t>
+            </w:r>
+          </w:p>
+        </w:tc>
+        <w:tc>
+          <w:tcPr>
+            <w:tcW w:type="dxa" w:w="6120"/>
+            <w:vAlign w:val="center"/>
+          </w:tcPr>
+          <w:p>
+            <w:r>
+              <w:t>Conservación y condición</w:t>
+            </w:r>
+          </w:p>
+        </w:tc>
+      </w:tr>
+      <w:tr>
+        <w:tc>
+          <w:tcPr>
+            <w:tcW w:type="dxa" w:w="3240"/>
+            <w:vAlign w:val="center"/>
+          </w:tcPr>
+          <w:p>
+            <w:r>
+              <w:t>Diagnóstico técnico</w:t>
+            </w:r>
+          </w:p>
+        </w:tc>
+        <w:tc>
+          <w:tcPr>
+            <w:tcW w:type="dxa" w:w="6120"/>
+            <w:vAlign w:val="center"/>
+          </w:tcPr>
+          <w:p>
+            <w:r>
+              <w:t>7 días desde created_at</w:t>
+            </w:r>
+          </w:p>
+        </w:tc>
+      </w:tr>
+      <w:tr>
+        <w:tc>
+          <w:tcPr>
+            <w:tcW w:type="dxa" w:w="3240"/>
+            <w:vAlign w:val="center"/>
+          </w:tcPr>
+          <w:p>
+            <w:r>
+              <w:t>Intentos de llamada</w:t>
+            </w:r>
+          </w:p>
+        </w:tc>
+        <w:tc>
+          <w:tcPr>
+            <w:tcW w:type="dxa" w:w="6120"/>
+            <w:vAlign w:val="center"/>
+          </w:tcPr>
+          <w:p>
+            <w:r>
+              <w:t>7 días</w:t>
+            </w:r>
+          </w:p>
+        </w:tc>
+      </w:tr>
+      <w:tr>
+        <w:tc>
+          <w:tcPr>
+            <w:tcW w:type="dxa" w:w="3240"/>
+            <w:vAlign w:val="center"/>
+          </w:tcPr>
+          <w:p>
+            <w:r>
+              <w:t>Señales ordinarias</w:t>
+            </w:r>
+          </w:p>
+        </w:tc>
+        <w:tc>
+          <w:tcPr>
+            <w:tcW w:type="dxa" w:w="6120"/>
+            <w:vAlign w:val="center"/>
+          </w:tcPr>
+          <w:p>
+            <w:r>
+              <w:t>30 días</w:t>
+            </w:r>
+          </w:p>
+        </w:tc>
+      </w:tr>
+      <w:tr>
+        <w:tc>
+          <w:tcPr>
+            <w:tcW w:type="dxa" w:w="3240"/>
+            <w:vAlign w:val="center"/>
+          </w:tcPr>
+          <w:p>
+            <w:r>
+              <w:t>Señales HIGH o CRITICAL</w:t>
+            </w:r>
+          </w:p>
+        </w:tc>
+        <w:tc>
+          <w:tcPr>
+            <w:tcW w:type="dxa" w:w="6120"/>
+            <w:vAlign w:val="center"/>
+          </w:tcPr>
+          <w:p>
+            <w:r>
+              <w:t>90 días</w:t>
+            </w:r>
+          </w:p>
+        </w:tc>
+      </w:tr>
+      <w:tr>
+        <w:tc>
+          <w:tcPr>
+            <w:tcW w:type="dxa" w:w="3240"/>
+            <w:vAlign w:val="center"/>
+          </w:tcPr>
+          <w:p>
+            <w:r>
+              <w:t>Reset administrativo</w:t>
+            </w:r>
+          </w:p>
+        </w:tc>
+        <w:tc>
+          <w:tcPr>
+            <w:tcW w:type="dxa" w:w="6120"/>
+            <w:vAlign w:val="center"/>
+          </w:tcPr>
+          <w:p>
+            <w:r>
+              <w:t>365 días</w:t>
+            </w:r>
+          </w:p>
+        </w:tc>
+      </w:tr>
+      <w:tr>
+        <w:tc>
+          <w:tcPr>
+            <w:tcW w:type="dxa" w:w="3240"/>
+            <w:vAlign w:val="center"/>
+          </w:tcPr>
+          <w:p>
+            <w:r>
+              <w:t>Estado de caller</w:t>
+            </w:r>
+          </w:p>
+        </w:tc>
+        <w:tc>
+          <w:tcPr>
+            <w:tcW w:type="dxa" w:w="6120"/>
+            <w:vAlign w:val="center"/>
+          </w:tcPr>
+          <w:p>
+            <w:r>
+              <w:t>90 días de inactividad, sólo con riesgo cero y sin bloqueo</w:t>
+            </w:r>
+          </w:p>
+        </w:tc>
+      </w:tr>
+      <w:tr>
+        <w:tc>
+          <w:tcPr>
+            <w:tcW w:type="dxa" w:w="3240"/>
+            <w:vAlign w:val="center"/>
+          </w:tcPr>
+          <w:p>
+            <w:r>
+              <w:t>Handoff finalizado</w:t>
+            </w:r>
+          </w:p>
+        </w:tc>
+        <w:tc>
+          <w:tcPr>
+            <w:tcW w:type="dxa" w:w="6120"/>
+            <w:vAlign w:val="center"/>
+          </w:tcPr>
+          <w:p>
+            <w:r>
+              <w:t>30 días; un callback pendiente nunca se borra automáticamente</w:t>
+            </w:r>
+          </w:p>
+        </w:tc>
+      </w:tr>
+      <w:tr>
+        <w:tc>
+          <w:tcPr>
+            <w:tcW w:type="dxa" w:w="3240"/>
+            <w:vAlign w:val="center"/>
+          </w:tcPr>
+          <w:p>
+            <w:r>
+              <w:t>Auditoría de purga</w:t>
+            </w:r>
+          </w:p>
+        </w:tc>
+        <w:tc>
+          <w:tcPr>
+            <w:tcW w:type="dxa" w:w="6120"/>
+            <w:vAlign w:val="center"/>
+          </w:tcPr>
+          <w:p>
+            <w:r>
+              <w:t>365 días; sólo timestamps y contadores</w:t>
+            </w:r>
+          </w:p>
+        </w:tc>
+      </w:tr>
+    </w:tbl>
+    <w:p>
+      <w:r>
+        <w:t>El cron purge-gemini-security-retention-v1 se ejecuta diariamente a las 03:17 UTC. Usa lotes máximos de 1.000 filas, elimina como máximo 10.000 filas por ejecución y evita ejecuciones concurrentes.</w:t>
+      </w:r>
+    </w:p>
+    <w:p>
+      <w:pPr>
+        <w:pStyle w:val="ListBullet"/>
+      </w:pPr>
+      <w:r>
+        <w:t>Los bloqueos permanentes requieren revisión después de 365 días y nunca se eliminan automáticamente.</w:t>
+      </w:r>
+    </w:p>
+    <w:p>
+      <w:pPr>
+        <w:pStyle w:val="ListBullet"/>
+      </w:pPr>
+      <w:r>
+        <w:t>Los callbacks pendientes se cuentan para revisión a los 30 días y como vencidos a los 90 días.</w:t>
+      </w:r>
+    </w:p>
+    <w:p>
+      <w:pPr>
+        <w:pStyle w:val="ListBullet"/>
+      </w:pPr>
+      <w:r>
+        <w:t>El cron registra cantidades y tiempos; no registra teléfonos, caller keys, tenant, call IDs ni payloads.</w:t>
+      </w:r>
+    </w:p>
+    <w:p>
+      <w:pPr>
+        <w:pStyle w:val="ListBullet"/>
+      </w:pPr>
+      <w:r>
+        <w:t>La migración se aplica por el canal administrativo de Supabase y no forma parte del despliegue de Worker o Media Edge.</w:t>
       </w:r>
     </w:p>
     <w:sectPr>

</xml_diff>

<commit_message>
docs(security): record retention deployment
</commit_message>
<xml_diff>
--- a/Security/IA_RealTime_CenterCall_Guia_Viva_Seguridad.docx
+++ b/Security/IA_RealTime_CenterCall_Guia_Viva_Seguridad.docx
@@ -1416,7 +1416,7 @@
           </w:tcPr>
           <w:p>
             <w:r>
-              <w:t>Implementado localmente; migración pendiente</w:t>
+              <w:t>Desplegado; cron activo y primera ejecución pendiente</w:t>
             </w:r>
           </w:p>
         </w:tc>
@@ -2903,7 +2903,7 @@
               <w:spacing w:after="0"/>
             </w:pPr>
             <w:r>
-              <w:t>Publicar, aplicar y verificar retención y borrado</w:t>
+              <w:t>Verificar primera ejecución programada de retención</w:t>
             </w:r>
           </w:p>
         </w:tc>
@@ -2917,7 +2917,7 @@
               <w:spacing w:after="0"/>
             </w:pPr>
             <w:r>
-              <w:t>PR y CI verdes; migración, cron, primera ejecución y advisors verificados</w:t>
+              <w:t>Cron succeeded; límite respetado; auditoría agregada y advisors revisados</w:t>
             </w:r>
           </w:p>
         </w:tc>
@@ -3626,7 +3626,7 @@
           </w:tcPr>
           <w:p>
             <w:r>
-              <w:t>Implementada localmente; migración productiva pendiente</w:t>
+              <w:t>Desplegada; cron activo y primera ejecución programada pendiente</w:t>
             </w:r>
           </w:p>
         </w:tc>
@@ -3677,7 +3677,7 @@
         <w:pStyle w:val="ListBullet"/>
       </w:pPr>
       <w:r>
-        <w:t>SEC-P1-04: migración privada implementada y validada en PostgreSQL 17; contrato 5/5 y baterías completas 184/184 PASS. Commit, PR, CI y aplicación remota pendientes.</w:t>
+        <w:t>SEC-P1-04: migración privada desplegada en Supabase como 20260913082816; PR #102 con CI verde; función, permisos y cron verificados. Primera ejecución programada pendiente.</w:t>
       </w:r>
     </w:p>
     <w:p>

</xml_diff>

<commit_message>
fix(security): harden retention maintenance
</commit_message>
<xml_diff>
--- a/Security/IA_RealTime_CenterCall_Guia_Viva_Seguridad.docx
+++ b/Security/IA_RealTime_CenterCall_Guia_Viva_Seguridad.docx
@@ -1416,7 +1416,7 @@
           </w:tcPr>
           <w:p>
             <w:r>
-              <w:t>Desplegado; cron activo y primera ejecución pendiente</w:t>
+              <w:t>Desplegado; corrección 20260913091400 aplicada; primera ejecución pendiente</w:t>
             </w:r>
           </w:p>
         </w:tc>
@@ -3626,7 +3626,7 @@
           </w:tcPr>
           <w:p>
             <w:r>
-              <w:t>Desplegada; cron activo y primera ejecución programada pendiente</w:t>
+              <w:t>Desplegada; corrección de seguridad aplicada y primera ejecución pendiente</w:t>
             </w:r>
           </w:p>
         </w:tc>
@@ -3677,7 +3677,7 @@
         <w:pStyle w:val="ListBullet"/>
       </w:pPr>
       <w:r>
-        <w:t>SEC-P1-04: migración privada desplegada en Supabase como 20260913082816; PR #102 con CI verde; función, permisos y cron verificados. Primera ejecución programada pendiente.</w:t>
+        <w:t>SEC-P1-04: migraciones 20260913082816 y 20260913091400 desplegadas en Supabase; la corrección preserva contadores de escalado, limita el statement programado y mantiene permisos privados. PR #102 pendiente de fusión; primera ejecución programada pendiente.</w:t>
       </w:r>
     </w:p>
     <w:p>
@@ -3927,7 +3927,7 @@
     </w:tbl>
     <w:p>
       <w:r>
-        <w:t>El cron purge-gemini-security-retention-v1 se ejecuta diariamente a las 03:17 UTC. Usa lotes máximos de 1.000 filas, elimina como máximo 10.000 filas por ejecución y evita ejecuciones concurrentes.</w:t>
+        <w:t>El cron purge-gemini-security-retention-v1 se ejecuta diariamente a las 03:17 UTC. Usa lotes máximos de 1.000 filas, elimina como máximo 10.000 filas por ejecución, evita ejecuciones concurrentes y establece un timeout de 30 segundos antes de invocar la función.</w:t>
       </w:r>
     </w:p>
     <w:p>
@@ -3935,7 +3935,7 @@
         <w:pStyle w:val="ListBullet"/>
       </w:pPr>
       <w:r>
-        <w:t>Los bloqueos permanentes requieren revisión después de 365 días y nunca se eliminan automáticamente.</w:t>
+        <w:t>Los bloqueos permanentes y los estados con security_strikes o rate_limit_blocks requieren revisión y nunca se eliminan automáticamente.</w:t>
       </w:r>
     </w:p>
     <w:p>

</xml_diff>

<commit_message>
security(db): add horizontal function boundary
</commit_message>
<xml_diff>
--- a/Security/IA_RealTime_CenterCall_Guia_Viva_Seguridad.docx
+++ b/Security/IA_RealTime_CenterCall_Guia_Viva_Seguridad.docx
@@ -144,7 +144,7 @@
             <w:r>
               <w:t>13 septiembre 2026</w:t>
               <w:br/>
-              <w:t>Stable d0e48b716d25</w:t>
+              <w:t>Stable 8ca13cb415bc</w:t>
             </w:r>
           </w:p>
         </w:tc>
@@ -1417,6 +1417,38 @@
           <w:p>
             <w:r>
               <w:t>Desplegado; corrección 20260913091400 aplicada; primera ejecución pendiente</w:t>
+            </w:r>
+          </w:p>
+        </w:tc>
+      </w:tr>
+      <w:tr>
+        <w:tc>
+          <w:tcPr>
+            <w:tcW w:type="dxa" w:w="3312"/>
+          </w:tcPr>
+          <w:p>
+            <w:r>
+              <w:t>Límite horizontal de funciones PostgreSQL</w:t>
+            </w:r>
+          </w:p>
+        </w:tc>
+        <w:tc>
+          <w:tcPr>
+            <w:tcW w:type="dxa" w:w="3312"/>
+          </w:tcPr>
+          <w:p>
+            <w:r>
+              <w:t>Privilegios seguros por defecto, cinco perfiles y manifiesto incremental</w:t>
+            </w:r>
+          </w:p>
+        </w:tc>
+        <w:tc>
+          <w:tcPr>
+            <w:tcW w:type="dxa" w:w="3312"/>
+          </w:tcPr>
+          <w:p>
+            <w:r>
+              <w:t>SEC-P1-05 validado localmente; pendiente de despliegue</w:t>
             </w:r>
           </w:p>
         </w:tc>
@@ -3096,6 +3128,48 @@
           </w:p>
         </w:tc>
       </w:tr>
+      <w:tr>
+        <w:tc>
+          <w:tcPr>
+            <w:tcW w:type="dxa" w:w="2484"/>
+          </w:tcPr>
+          <w:p>
+            <w:r>
+              <w:t>SEC-P1-05</w:t>
+            </w:r>
+          </w:p>
+        </w:tc>
+        <w:tc>
+          <w:tcPr>
+            <w:tcW w:type="dxa" w:w="2484"/>
+          </w:tcPr>
+          <w:p>
+            <w:r>
+              <w:t>P1</w:t>
+            </w:r>
+          </w:p>
+        </w:tc>
+        <w:tc>
+          <w:tcPr>
+            <w:tcW w:type="dxa" w:w="2484"/>
+          </w:tcPr>
+          <w:p>
+            <w:r>
+              <w:t>Activar contrato horizontal para toda función PostgreSQL nueva</w:t>
+            </w:r>
+          </w:p>
+        </w:tc>
+        <w:tc>
+          <w:tcPr>
+            <w:tcW w:type="dxa" w:w="2484"/>
+          </w:tcPr>
+          <w:p>
+            <w:r>
+              <w:t>Gate incremental 3/3; sin cambios en funciones heredadas ni hot path</w:t>
+            </w:r>
+          </w:p>
+        </w:tc>
+      </w:tr>
     </w:tbl>
     <w:p>
       <w:pPr>
@@ -3631,6 +3705,28 @@
           </w:p>
         </w:tc>
       </w:tr>
+      <w:tr>
+        <w:tc>
+          <w:tcPr>
+            <w:tcW w:type="dxa" w:w="4968"/>
+          </w:tcPr>
+          <w:p>
+            <w:r>
+              <w:t>Funciones PostgreSQL nuevas con perfil, search_path vacío y ejecución mínima</w:t>
+            </w:r>
+          </w:p>
+        </w:tc>
+        <w:tc>
+          <w:tcPr>
+            <w:tcW w:type="dxa" w:w="4968"/>
+          </w:tcPr>
+          <w:p>
+            <w:r>
+              <w:t>Implementada localmente; pendiente de despliegue</w:t>
+            </w:r>
+          </w:p>
+        </w:tc>
+      </w:tr>
     </w:tbl>
     <w:p>
       <w:pPr>
@@ -3645,7 +3741,7 @@
         <w:pStyle w:val="ListBullet"/>
       </w:pPr>
       <w:r>
-        <w:t>Base estable verificada: rebuild/v39-stable-baseline @ d0e48b716d250c666e4873633809fe4699f98a28.</w:t>
+        <w:t>Base estable verificada: rebuild/v39-stable-baseline @ 8ca13cb415bc3596134f6245697b5ccaf5b0cf9e.</w:t>
       </w:r>
     </w:p>
     <w:p>
@@ -3677,7 +3773,7 @@
         <w:pStyle w:val="ListBullet"/>
       </w:pPr>
       <w:r>
-        <w:t>SEC-P1-04: migraciones 20260913082816 y 20260913091400 desplegadas en Supabase; la corrección preserva contadores de escalado, limita el statement programado y mantiene permisos privados. PR #102 pendiente de fusión; primera ejecución programada pendiente.</w:t>
+        <w:t>SEC-P1-04: migraciones 20260913082816 y 20260913091400 desplegadas en Supabase; la corrección preserva contadores de escalado, limita el statement programado y mantiene permisos privados. PR #102 fusionado en stable 8ca13cb415bc; primera ejecución programada pendiente.</w:t>
       </w:r>
     </w:p>
     <w:p>
@@ -3960,6 +4056,29 @@
       </w:pPr>
       <w:r>
         <w:t>La migración se aplica por el canal administrativo de Supabase y no forma parte del despliegue de Worker o Media Edge.</w:t>
+      </w:r>
+    </w:p>
+    <w:p>
+      <w:pPr>
+        <w:pStyle w:val="Heading1"/>
+      </w:pPr>
+      <w:r>
+        <w:t>14 Límite horizontal de funciones PostgreSQL</w:t>
+      </w:r>
+    </w:p>
+    <w:p>
+      <w:r>
+        <w:t>SEC-P1-05 define un contrato común para cualquier función PostgreSQL nueva, sin depender del tenant ni de la vertical que la utilice.</w:t>
+      </w:r>
+    </w:p>
+    <w:p>
+      <w:r>
+        <w:t>La migración de activación retira globalmente a PUBLIC, anon y authenticated el permiso de ejecución que PostgreSQL concede por defecto a funciones futuras creadas por postgres. El manifiesto administra el esquema public y no modifica ninguna función heredada.</w:t>
+      </w:r>
+    </w:p>
+    <w:p>
+      <w:r>
+        <w:t>El manifiesto común define cinco perfiles y una lista cerrada de nombres heredados. El gate administra toda función pública nueva, incluso si su migración se fecha incorrectamente antes de la activación. Exige esquema explícito, search_path vacío, capacidad propietaria, revocación previa y permisos exactos. El contrato pasó 3 de 3 casos, no repite las suites de los ejecutables y no añade trabajo al hot path. Todavía no se ha aplicado a producción.</w:t>
       </w:r>
     </w:p>
     <w:sectPr>

</xml_diff>

<commit_message>
refactor(kernel): extract horizontal temporal authority
</commit_message>
<xml_diff>
--- a/Security/IA_RealTime_CenterCall_Guia_Viva_Seguridad.docx
+++ b/Security/IA_RealTime_CenterCall_Guia_Viva_Seguridad.docx
@@ -3741,7 +3741,7 @@
         <w:pStyle w:val="ListBullet"/>
       </w:pPr>
       <w:r>
-        <w:t>Base estable verificada: rebuild/v39-stable-baseline @ 8ca13cb415bc3596134f6245697b5ccaf5b0cf9e.</w:t>
+        <w:t>Base estable remota auditada: rebuild/v39-stable-baseline @ dc45e5d0e5f27371d8081ef4c70e7d32a7e56b50 (2026-09-27). El runtime efectivo sigue identificado por el tag fast-d0e48b716d25; repositorio y despliegue no se confunden.</w:t>
       </w:r>
     </w:p>
     <w:p>
@@ -3773,7 +3773,15 @@
         <w:pStyle w:val="ListBullet"/>
       </w:pPr>
       <w:r>
-        <w:t>SEC-P1-04: migraciones 20260913082816 y 20260913091400 desplegadas en Supabase; la corrección preserva contadores de escalado, limita el statement programado y mantiene permisos privados. PR #102 fusionado en stable 8ca13cb415bc; primera ejecución programada pendiente.</w:t>
+        <w:t>SEC-P1-04: migraciones 20260913082816 y 20260913091400 desplegadas en Supabase; la corrección preserva contadores de escalado, limita el statement programado y mantiene permisos privados. La ejecución efectiva del cron no pudo verificarse el 2026-09-27 porque la identidad del conector no tenía permiso sobre cron/private; no se declara cerrada sin evidencia administrativa.</w:t>
+      </w:r>
+    </w:p>
+    <w:p>
+      <w:pPr>
+        <w:pStyle w:val="ListBullet"/>
+      </w:pPr>
+      <w:r>
+        <w:t>Autoridad temporal horizontal: capability Fast existente; Core neutral extraído en apps/gemini-control-plane/src/kernel/temporal-authority.ts y validado localmente con 24/24 pruebas focalizadas y typecheck PASS. La extracción aún no está publicada ni desplegada.</w:t>
       </w:r>
     </w:p>
     <w:p>
@@ -4078,7 +4086,60 @@
     </w:p>
     <w:p>
       <w:r>
-        <w:t>El manifiesto común define cinco perfiles y una lista cerrada de nombres heredados. El gate administra toda función pública nueva, incluso si su migración se fecha incorrectamente antes de la activación. Exige esquema explícito, search_path vacío, capacidad propietaria, revocación previa y permisos exactos. El contrato pasó 3 de 3 casos, no repite las suites de los ejecutables y no añade trabajo al hot path. Todavía no se ha aplicado a producción.</w:t>
+        <w:t>El manifiesto común define cinco perfiles y una lista cerrada de nombres heredados. El gate administra toda función pública nueva, incluso si su migración se fecha incorrectamente antes de la activación. Exige esquema explícito, search_path vacío, capacidad propietaria, revocación previa y permisos exactos. El contrato pasó 3 de 3 casos, no repite las suites de los ejecutables y no añade trabajo al hot path. Las migraciones 20260913193440 y 20260913193454 están aplicadas y sus ACL fueron verificadas.</w:t>
+      </w:r>
+    </w:p>
+    <w:p>
+      <w:pPr>
+        <w:pStyle w:val="Heading1"/>
+      </w:pPr>
+      <w:r>
+        <w:t>15. Autoridad temporal horizontal</w:t>
+      </w:r>
+    </w:p>
+    <w:p>
+      <w:r>
+        <w:t>El reloj actual, el calendario y la zona horaria IANA del tenant tienen un único owner en el kernel transversal. El modelo interpreta el lenguaje natural, pero no inventa el ‘ahora’. El adapter Gemini Fast conserva la tool get_authoritative_datetime y la capability time.authoritative; no se crea una tool distinta por provider, tenant o vertical.</w:t>
+      </w:r>
+    </w:p>
+    <w:p>
+      <w:pPr>
+        <w:pStyle w:val="ListBullet"/>
+      </w:pPr>
+      <w:r>
+        <w:t>El Core temporal es neutral: no conoce businessType, clínica, restaurante, reservas ni citas.</w:t>
+      </w:r>
+    </w:p>
+    <w:p>
+      <w:pPr>
+        <w:pStyle w:val="ListBullet"/>
+      </w:pPr>
+      <w:r>
+        <w:t>Los horarios comerciales, horizontes de cita/reserva, capacidad y disponibilidad siguen siendo políticas verticales.</w:t>
+      </w:r>
+    </w:p>
+    <w:p>
+      <w:pPr>
+        <w:pStyle w:val="ListBullet"/>
+      </w:pPr>
+      <w:r>
+        <w:t>Una zona inválida, tenant inconsistente o autoridad no disponible falla cerrada; Media Edge no usa su reloj como fallback.</w:t>
+      </w:r>
+    </w:p>
+    <w:p>
+      <w:pPr>
+        <w:pStyle w:val="ListBullet"/>
+      </w:pPr>
+      <w:r>
+        <w:t>El snapshot inicial viaja en bootstrap y el refresh sólo ocurre on-demand por control autenticado; no añade persistencia, inferencia ni trabajo por chunk.</w:t>
+      </w:r>
+    </w:p>
+    <w:p>
+      <w:pPr>
+        <w:pStyle w:val="ListBullet"/>
+      </w:pPr>
+      <w:r>
+        <w:t>La compatibilidad actual admite business.timezone, business.time_zone o timezone y usa Europe/Madrid cuando el tenant no declara zona.</w:t>
       </w:r>
     </w:p>
     <w:sectPr>

</xml_diff>

<commit_message>
docs: record temporal authority deployment
</commit_message>
<xml_diff>
--- a/Security/IA_RealTime_CenterCall_Guia_Viva_Seguridad.docx
+++ b/Security/IA_RealTime_CenterCall_Guia_Viva_Seguridad.docx
@@ -3741,7 +3741,7 @@
         <w:pStyle w:val="ListBullet"/>
       </w:pPr>
       <w:r>
-        <w:t>Base estable remota auditada: rebuild/v39-stable-baseline @ dc45e5d0e5f27371d8081ef4c70e7d32a7e56b50 (2026-09-27). El runtime efectivo sigue identificado por el tag fast-d0e48b716d25; repositorio y despliegue no se confunden.</w:t>
+        <w:t>Base estable remota auditada: rebuild/v39-stable-baseline @ 19049d7d06260c9e9dfa6fa50fb0e8f4330a37c4 (2026-09-28). El runtime efectivo fue desplegado desde ese SHA por el workflow 36356056366.</w:t>
       </w:r>
     </w:p>
     <w:p>
@@ -3749,7 +3749,7 @@
         <w:pStyle w:val="ListBullet"/>
       </w:pPr>
       <w:r>
-        <w:t>Corrección de despedida: PR #100 desplegada; la revisión gemini-media-edge-00227-qub recibe el 100 % del tráfico y el hangup espera la marca Telnyx exacta antes del cierre.</w:t>
+        <w:t>Runtime Gemini Fast efectivo: la revisión gemini-media-edge-00230-diw recibe el 100 % del tráfico con el tag fast-19049d7d0626. El workflow verificó readiness, bootstrap/HMAC, paridad del token de seguridad y la URL general.</w:t>
       </w:r>
     </w:p>
     <w:p>
@@ -3773,7 +3773,7 @@
         <w:pStyle w:val="ListBullet"/>
       </w:pPr>
       <w:r>
-        <w:t>SEC-P1-04: migraciones 20260913082816 y 20260913091400 desplegadas en Supabase; la corrección preserva contadores de escalado, limita el statement programado y mantiene permisos privados. La ejecución efectiva del cron no pudo verificarse el 2026-09-27 porque la identidad del conector no tenía permiso sobre cron/private; no se declara cerrada sin evidencia administrativa.</w:t>
+        <w:t>SEC-P1-04: migraciones 20260913082816 y 20260913091400 desplegadas en Supabase; la corrección preserva contadores de escalado, limita el statement programado y mantiene permisos privados. La ejecución efectiva del cron no pudo verificarse el 2026-09-28 porque la identidad del conector no tenía permiso sobre cron/private; no se declara cerrada sin evidencia administrativa.</w:t>
       </w:r>
     </w:p>
     <w:p>
@@ -3781,7 +3781,7 @@
         <w:pStyle w:val="ListBullet"/>
       </w:pPr>
       <w:r>
-        <w:t>Autoridad temporal horizontal: capability Fast existente; Core neutral extraído en apps/gemini-control-plane/src/kernel/temporal-authority.ts y validado localmente con 24/24 pruebas focalizadas y typecheck PASS. La extracción aún no está publicada ni desplegada.</w:t>
+        <w:t>Autoridad temporal horizontal: Core neutral y adapter Fast compatible fusionados mediante PR #106 y desplegados desde 19049d7d0626. Pasaron 24/24 pruebas focalizadas, Control Plane 87/87, Media Edge 116/116 y los preflights del workflow 36356056366. El cambio no añadió trabajo por chunk.</w:t>
       </w:r>
     </w:p>
     <w:p>

</xml_diff>

<commit_message>
docs: align canonical guidance with production state
</commit_message>
<xml_diff>
--- a/Security/IA_RealTime_CenterCall_Guia_Viva_Seguridad.docx
+++ b/Security/IA_RealTime_CenterCall_Guia_Viva_Seguridad.docx
@@ -142,9 +142,9 @@
           </w:tcPr>
           <w:p>
             <w:r>
-              <w:t>13 septiembre 2026</w:t>
+              <w:t>30 septiembre 2026</w:t>
               <w:br/>
-              <w:t>Stable 8ca13cb415bc</w:t>
+              <w:t>Stable 734b3b4fda7a</w:t>
             </w:r>
           </w:p>
         </w:tc>
@@ -191,7 +191,7 @@
     </w:p>
     <w:p>
       <w:r>
-        <w:t>El único producto realtime ejecutable es Gemini Fast. El Worker controla señalización, tenant, admission, seguridad, tools y auditoría. El Media Edge transporta audio directamente entre Telnyx y Gemini Live.</w:t>
+        <w:t>El único producto realtime ejecutable es Gemini Fast. El Worker controla señalización, tenant, admission, seguridad, tools, auditoría y comunicaciones externas. El Media Edge transporta audio directamente entre Telnyx y Gemini Live. No existe dependencia ejecutable de OpenAI en el runtime vigente.</w:t>
       </w:r>
     </w:p>
     <w:tbl>
@@ -1381,7 +1381,7 @@
           </w:tcPr>
           <w:p>
             <w:r>
-              <w:t>PR #101 fusionada; gate CI verde</w:t>
+              <w:t>PR #101 fusionada; suites actuales PASS</w:t>
             </w:r>
           </w:p>
         </w:tc>
@@ -1416,7 +1416,7 @@
           </w:tcPr>
           <w:p>
             <w:r>
-              <w:t>Desplegado; corrección 20260913091400 aplicada; primera ejecución pendiente</w:t>
+              <w:t>Desplegado; ejecución programada no verificable con la identidad actual</w:t>
             </w:r>
           </w:p>
         </w:tc>
@@ -1448,7 +1448,39 @@
           </w:tcPr>
           <w:p>
             <w:r>
-              <w:t>SEC-P1-05 validado localmente; pendiente de despliegue</w:t>
+              <w:t>SEC-P1-05 desplegado; migraciones y ACL verificados</w:t>
+            </w:r>
+          </w:p>
+        </w:tc>
+      </w:tr>
+      <w:tr>
+        <w:tc>
+          <w:tcPr>
+            <w:tcW w:type="dxa" w:w="3312"/>
+          </w:tcPr>
+          <w:p>
+            <w:r>
+              <w:t>WhatsApp transaccional Meta</w:t>
+            </w:r>
+          </w:p>
+        </w:tc>
+        <w:tc>
+          <w:tcPr>
+            <w:tcW w:type="dxa" w:w="3312"/>
+          </w:tcPr>
+          <w:p>
+            <w:r>
+              <w:t>Capability tenant-bound, configuración tenant-owned, allowlist, secreto Worker e idempotencia KV acotada</w:t>
+            </w:r>
+          </w:p>
+        </w:tc>
+        <w:tc>
+          <w:tcPr>
+            <w:tcW w:type="dxa" w:w="3312"/>
+          </w:tcPr>
+          <w:p>
+            <w:r>
+              <w:t>Canary desplegado; sin envío real, webhook ni evidencia de entrega</w:t>
             </w:r>
           </w:p>
         </w:tc>
@@ -2764,6 +2796,28 @@
           </w:p>
         </w:tc>
       </w:tr>
+      <w:tr>
+        <w:tc>
+          <w:tcPr>
+            <w:tcW w:type="dxa" w:w="4968"/>
+          </w:tcPr>
+          <w:p>
+            <w:r>
+              <w:t>Token Meta o configuración cross-tenant</w:t>
+            </w:r>
+          </w:p>
+        </w:tc>
+        <w:tc>
+          <w:tcPr>
+            <w:tcW w:type="dxa" w:w="4968"/>
+          </w:tcPr>
+          <w:p>
+            <w:r>
+              <w:t>Secret fuera de KV/Git, tenant binding, capability y allowlist</w:t>
+            </w:r>
+          </w:p>
+        </w:tc>
+      </w:tr>
     </w:tbl>
     <w:p>
       <w:pPr>
@@ -3135,7 +3189,7 @@
           </w:tcPr>
           <w:p>
             <w:r>
-              <w:t>SEC-P1-05</w:t>
+              <w:t>COMMS-P1-01</w:t>
             </w:r>
           </w:p>
         </w:tc>
@@ -3145,7 +3199,7 @@
           </w:tcPr>
           <w:p>
             <w:r>
-              <w:t>P1</w:t>
+              <w:t>P1 antes de citas reales</w:t>
             </w:r>
           </w:p>
         </w:tc>
@@ -3155,7 +3209,7 @@
           </w:tcPr>
           <w:p>
             <w:r>
-              <w:t>Activar contrato horizontal para toda función PostgreSQL nueva</w:t>
+              <w:t>Outbox atómica, reconciliación y webhooks WhatsApp</w:t>
             </w:r>
           </w:p>
         </w:tc>
@@ -3165,7 +3219,49 @@
           </w:tcPr>
           <w:p>
             <w:r>
-              <w:t>Gate incremental 3/3; sin cambios en funciones heredadas ni hot path</w:t>
+              <w:t>Claim durable, firma webhook, estados de entrega y E2E autorizado</w:t>
+            </w:r>
+          </w:p>
+        </w:tc>
+      </w:tr>
+      <w:tr>
+        <w:tc>
+          <w:tcPr>
+            <w:tcW w:type="dxa" w:w="2484"/>
+          </w:tcPr>
+          <w:p>
+            <w:r>
+              <w:t>DEPLOY-P2-01</w:t>
+            </w:r>
+          </w:p>
+        </w:tc>
+        <w:tc>
+          <w:tcPr>
+            <w:tcW w:type="dxa" w:w="2484"/>
+          </w:tcPr>
+          <w:p>
+            <w:r>
+              <w:t>P2 operativa</w:t>
+            </w:r>
+          </w:p>
+        </w:tc>
+        <w:tc>
+          <w:tcPr>
+            <w:tcW w:type="dxa" w:w="2484"/>
+          </w:tcPr>
+          <w:p>
+            <w:r>
+              <w:t>Cubrir src/communications/** en push.paths</w:t>
+            </w:r>
+          </w:p>
+        </w:tc>
+        <w:tc>
+          <w:tcPr>
+            <w:tcW w:type="dxa" w:w="2484"/>
+          </w:tcPr>
+          <w:p>
+            <w:r>
+              <w:t>Un cambio aislado dispara el workflow integral; mientras tanto se usa workflow_dispatch</w:t>
             </w:r>
           </w:p>
         </w:tc>
@@ -3676,7 +3772,7 @@
           </w:tcPr>
           <w:p>
             <w:r>
-              <w:t>PR #101 fusionada; CI verde</w:t>
+              <w:t>PR #101 fusionada; CI y suites propietarias verdes</w:t>
             </w:r>
           </w:p>
         </w:tc>
@@ -3700,7 +3796,7 @@
           </w:tcPr>
           <w:p>
             <w:r>
-              <w:t>Desplegada; corrección de seguridad aplicada y primera ejecución pendiente</w:t>
+              <w:t>Desplegada; verificación de ejecución programada pendiente por permisos</w:t>
             </w:r>
           </w:p>
         </w:tc>
@@ -3722,7 +3818,29 @@
           </w:tcPr>
           <w:p>
             <w:r>
-              <w:t>Implementada localmente; pendiente de despliegue</w:t>
+              <w:t>Desplegada; migraciones y ACL verificadas</w:t>
+            </w:r>
+          </w:p>
+        </w:tc>
+      </w:tr>
+      <w:tr>
+        <w:tc>
+          <w:tcPr>
+            <w:tcW w:type="dxa" w:w="4968"/>
+          </w:tcPr>
+          <w:p>
+            <w:r>
+              <w:t>WhatsApp sólo con configuración y capability del tenant</w:t>
+            </w:r>
+          </w:p>
+        </w:tc>
+        <w:tc>
+          <w:tcPr>
+            <w:tcW w:type="dxa" w:w="4968"/>
+          </w:tcPr>
+          <w:p>
+            <w:r>
+              <w:t>Canary desplegado; producción funcional pendiente de outbox/webhooks</w:t>
             </w:r>
           </w:p>
         </w:tc>
@@ -3741,7 +3859,7 @@
         <w:pStyle w:val="ListBullet"/>
       </w:pPr>
       <w:r>
-        <w:t>Base estable remota auditada: rebuild/v39-stable-baseline @ 19049d7d06260c9e9dfa6fa50fb0e8f4330a37c4 (2026-09-28). El runtime efectivo fue desplegado desde ese SHA por el workflow 36356056366.</w:t>
+        <w:t>Base estable remota auditada: rebuild/v39-stable-baseline @ 734b3b4fda7ae84b35270c1c813ccafb7171f8d8 (2026-09-30). El runtime de producción procede del merge SHA 98b62a4dbf0456b13219cb945b544b67f41a88e6 y del workflow 36375878767.</w:t>
       </w:r>
     </w:p>
     <w:p>
@@ -3749,7 +3867,7 @@
         <w:pStyle w:val="ListBullet"/>
       </w:pPr>
       <w:r>
-        <w:t>Runtime Gemini Fast efectivo: la revisión gemini-media-edge-00230-diw recibe el 100 % del tráfico con el tag fast-19049d7d0626. El workflow verificó readiness, bootstrap/HMAC, paridad del token de seguridad y la URL general.</w:t>
+        <w:t>Runtime Gemini Fast efectivo: la revisión gemini-media-edge-00237-neb recibe el 100 % del tráfico con el tag fast-98b62a4dbf04. Cloud Run confirma 1 vCPU, 512 MiB, containerConcurrency=25, minScale=1 y maxScale=1; /ready respondió correctamente el 2026-09-30.</w:t>
       </w:r>
     </w:p>
     <w:p>
@@ -3765,7 +3883,7 @@
         <w:pStyle w:val="ListBullet"/>
       </w:pPr>
       <w:r>
-        <w:t>SEC-P1-03: runner común y workflow Gemini Security Regression Gate publicados mediante PR #101; gate ampliado a 157/157 pruebas específicas PASS.</w:t>
+        <w:t>SEC-P1-03: runner común y separación de ownership de suites publicados mediante PR #101. La verificación local del 2026-09-30 pasó 103 pruebas de seguridad del Media Edge, 64 del Control Plane y 3 del contrato PostgreSQL; las suites completas pasaron 116/116 y 96/96 respectivamente.</w:t>
       </w:r>
     </w:p>
     <w:p>
@@ -3773,7 +3891,7 @@
         <w:pStyle w:val="ListBullet"/>
       </w:pPr>
       <w:r>
-        <w:t>SEC-P1-04: migraciones 20260913082816 y 20260913091400 desplegadas en Supabase; la corrección preserva contadores de escalado, limita el statement programado y mantiene permisos privados. La ejecución efectiva del cron no pudo verificarse el 2026-09-28 porque la identidad del conector no tenía permiso sobre cron/private; no se declara cerrada sin evidencia administrativa.</w:t>
+        <w:t>SEC-P1-04: migraciones 20260913082816 y 20260913091400 desplegadas en Supabase; la corrección preserva contadores de escalado, limita el statement programado y mantiene permisos privados. La ejecución efectiva del cron sigue sin poder verificarse el 2026-09-30 porque la identidad del conector devuelve permission denied sobre cron/private; no se declara cerrada sin evidencia administrativa.</w:t>
       </w:r>
     </w:p>
     <w:p>
@@ -3781,7 +3899,7 @@
         <w:pStyle w:val="ListBullet"/>
       </w:pPr>
       <w:r>
-        <w:t>Autoridad temporal horizontal: Core neutral y adapter Fast compatible fusionados mediante PR #106 y desplegados desde 19049d7d0626. Pasaron 24/24 pruebas focalizadas, Control Plane 87/87, Media Edge 116/116 y los preflights del workflow 36356056366. El cambio no añadió trabajo por chunk.</w:t>
+        <w:t>Autoridad temporal horizontal: Core neutral y adapter Fast compatible originados en PR #106 e incluidos en la revisión efectiva gemini-media-edge-00237-neb. El snapshot inicial viaja en bootstrap y el refresh ocurre sólo on-demand; no añade trabajo por chunk.</w:t>
       </w:r>
     </w:p>
     <w:p>
@@ -4142,6 +4260,34 @@
         <w:t>La compatibilidad actual admite business.timezone, business.time_zone o timezone y usa Europe/Madrid cuando el tenant no declara zona.</w:t>
       </w:r>
     </w:p>
+    <w:p>
+      <w:pPr>
+        <w:pStyle w:val="Heading1"/>
+      </w:pPr>
+      <w:r>
+        <w:t>16. Comunicación externa: WhatsApp transaccional</w:t>
+      </w:r>
+    </w:p>
+    <w:p>
+      <w:r>
+        <w:t>El canary horizontal vive en el Gemini Fast Worker y queda fuera del hot path de audio. Sólo acepta la capability message.whatsapp.transactional y la configuración tenant_config:&lt;tenantId&gt;.communications.whatsapp. Las claves KV globales whatsapp.* fueron retiradas y no son fallback.</w:t>
+      </w:r>
+    </w:p>
+    <w:p>
+      <w:r>
+        <w:t>META_WHATSAPP_ACCESS_TOKEN es un Worker Secret. phone_number_id, waba_id, idioma y allowlist de plantillas pertenecen al documento del tenant. El endpoint interno no registra teléfono ni parámetros y conserva durante siete días únicamente un recibo KV con idempotency hash, message_id, timestamp y plantilla.</w:t>
+      </w:r>
+    </w:p>
+    <w:p>
+      <w:r>
+        <w:t>ACCEPTED_BY_META sólo significa que Meta devolvió un message_id. Sin webhook firmado, reconciliación y outbox con claim atómico no existe evidencia de entrega ni garantía frente a carreras o timeouts inciertos. Por ello el canary no se conecta aún al commit de una cita o reserva real.</w:t>
+      </w:r>
+    </w:p>
+    <w:p>
+      <w:r>
+        <w:t>El filtro automático de Gemini Fast Canary Deploy no cubre todavía src/communications/**. Hasta corregirlo, un cambio aislado de ese módulo requiere workflow_dispatch del mismo workflow después de CI; no se crea una segunda autoridad de despliegue.</w:t>
+      </w:r>
+    </w:p>
     <w:sectPr>
       <w:footerReference w:type="default" r:id="rId9"/>
       <w:pgSz w:w="12240" w:h="15840"/>

</xml_diff>